<commit_message>
updated homework 2 after mentor comments
</commit_message>
<xml_diff>
--- a/db_normalization_2/homework_2.docx
+++ b/db_normalization_2/homework_2.docx
@@ -731,7 +731,7 @@
           <w:sz w:val="24"/>
           <w:szCs w:val="24"/>
         </w:rPr>
-        <w:t>): профессор, предмет.</w:t>
+        <w:t>): id, профессор, предмет.</w:t>
       </w:r>
     </w:p>
     <w:p>
@@ -5452,7 +5452,7 @@
           <w:sz w:val="24"/>
           <w:szCs w:val="24"/>
         </w:rPr>
-        <w:t>professor_id: INTEGER, PK, NOT NULL;</w:t>
+        <w:t>professor_subjects_id: INTEGER, PK, NOT NULL;</w:t>
       </w:r>
     </w:p>
     <w:p>
@@ -5486,7 +5486,41 @@
           <w:sz w:val="24"/>
           <w:szCs w:val="24"/>
         </w:rPr>
-        <w:t>subject_id INTEGER, PK, NOT NULL;</w:t>
+        <w:t>professor_id: INTEGER, FK, NOT NULL;</w:t>
+      </w:r>
+    </w:p>
+    <w:p>
+      <w:pPr>
+        <w:pStyle w:val="Normal"/>
+        <w:numPr>
+          <w:ilvl w:val="0"/>
+          <w:numId w:val="14"/>
+        </w:numPr>
+        <w:bidi w:val="0"/>
+        <w:ind w:hanging="0" w:left="0"/>
+        <w:jc w:val="left"/>
+        <w:rPr>
+          <w:rFonts w:ascii="ArialMT" w:hAnsi="ArialMT"/>
+          <w:b w:val="false"/>
+          <w:i w:val="false"/>
+          <w:color w:val="auto"/>
+          <w:spacing w:val="0"/>
+          <w:kern w:val="2"/>
+          <w:sz w:val="32"/>
+        </w:rPr>
+      </w:pPr>
+      <w:r>
+        <w:rPr>
+          <w:rFonts w:ascii="Times New Roman" w:hAnsi="Times New Roman"/>
+          <w:b w:val="false"/>
+          <w:i w:val="false"/>
+          <w:color w:val="auto"/>
+          <w:spacing w:val="0"/>
+          <w:kern w:val="2"/>
+          <w:sz w:val="24"/>
+          <w:szCs w:val="24"/>
+        </w:rPr>
+        <w:t>subject_id INTEGER, FK, NOT NULL;</w:t>
       </w:r>
     </w:p>
     <w:p>
@@ -8965,17 +8999,7 @@
           <w:sz w:val="24"/>
           <w:szCs w:val="24"/>
         </w:rPr>
-        <w:t>Part 3: ER-диа</w:t>
-      </w:r>
-      <w:r>
-        <w:rPr>
-          <w:rFonts w:ascii="Times New Roman" w:hAnsi="Times New Roman"/>
-          <w:i/>
-          <w:color w:val="000000"/>
-          <w:sz w:val="24"/>
-          <w:szCs w:val="24"/>
-        </w:rPr>
-        <w:t>грамма</w:t>
+        <w:t>Part 3: ER-диаграмма</w:t>
       </w:r>
     </w:p>
     <w:p>
@@ -9008,11 +9032,11 @@
       </w:pPr>
       <w:r>
         <w:rPr>
-          <w:rFonts w:ascii="Times New Roman" w:hAnsi="Times New Roman"/>
+          <w:rFonts w:ascii="Arial-ItalicMT" w:hAnsi="Arial-ItalicMT"/>
+          <w:b w:val="false"/>
           <w:i/>
           <w:color w:val="000000"/>
-          <w:sz w:val="24"/>
-          <w:szCs w:val="24"/>
+          <w:sz w:val="32"/>
         </w:rPr>
         <w:drawing>
           <wp:anchor distT="0" distB="0" distL="0" distR="0" simplePos="0" relativeHeight="2" behindDoc="0" locked="0" layoutInCell="0" allowOverlap="1">
@@ -9023,7 +9047,7 @@
             <wp:positionV relativeFrom="paragraph">
               <wp:posOffset>635</wp:posOffset>
             </wp:positionV>
-            <wp:extent cx="6120130" cy="3541395"/>
+            <wp:extent cx="6120130" cy="3757295"/>
             <wp:effectExtent l="0" t="0" r="0" b="0"/>
             <wp:wrapSquare wrapText="largest"/>
             <wp:docPr id="1" name="Image1"/>
@@ -9048,7 +9072,7 @@
                   <pic:spPr bwMode="auto">
                     <a:xfrm>
                       <a:off x="0" y="0"/>
-                      <a:ext cx="6120130" cy="3541395"/>
+                      <a:ext cx="6120130" cy="3757295"/>
                     </a:xfrm>
                     <a:prstGeom prst="rect">
                       <a:avLst/>

</xml_diff>